<commit_message>
docs: clarify sequence-specific addendum status
Co-authored-by: arena-agent <297053741+arena-agent@users.noreply.github.com>
</commit_message>
<xml_diff>
--- a/deliverables/abeta_pc12_literature_review/Aβ聚集抑制与PC12神经保护_12条候选肽_文献与模型审查_初版.docx
+++ b/deliverables/abeta_pc12_literature_review/Aβ聚集抑制与PC12神经保护_12条候选肽_文献与模型审查_初版.docx
@@ -32,7 +32,7 @@
           <w:rFonts w:ascii="Microsoft YaHei" w:hAnsi="Microsoft YaHei" w:eastAsia="Microsoft YaHei"/>
           <w:sz w:val="18"/>
         </w:rPr>
-        <w:t>适用范围：12 条候选肽的 Aβ 聚集抑制 / Aβ 毒性缓解 / PC12 神经保护筛选。</w:t>
+        <w:t>历史适用范围：这是最早建立的通用“ Aβ 聚集抑制 / Aβ 毒性缓解 / PC12 神经保护”文献包，不是当前 12 条肽的促 Aβ 聚集 / 神经毒性结论。</w:t>
       </w:r>
     </w:p>
     <w:p>
@@ -41,7 +41,7 @@
           <w:rFonts w:ascii="Microsoft YaHei" w:hAnsi="Microsoft YaHei" w:eastAsia="Microsoft YaHei"/>
           <w:sz w:val="18"/>
         </w:rPr>
-        <w:t>重要限制：用户指定的 从12条肽筛选Aβ聚集与PC12实验.docx 尚未同步到当前工作区。因此，本文件是按文件名所指的研究问题做的文献与方法学审查，并不把任何结论冒充为对那 12 条真实序列、修饰、浓度或既定 protocol 的特异性判断。收到文档（或序列表）后，才能做逐条肽映射、候选优先级和计算输入表。</w:t>
+        <w:t>状态更新：用户随后已在对话中粘贴完整的 12 条序列、对接/MD 摘要和实验条件。其序列特异性文献映射、AChE–PAS 逻辑复核、ML 适用性、逐条优先级与湿实验控制已另行写入 Aβ促聚集_AChE-PAS_12条对接肽_序列特异性复核与湿实验计划_v2（.md / .docx）及配套 CSV。本初版保留为历史性的通用抑制/神经保护背景，不应再被解释为“正在等待文档”或用于支持现有促聚集假说。</w:t>
       </w:r>
     </w:p>
     <w:p>
@@ -4361,7 +4361,7 @@
         <w:color w:val="607D8B"/>
         <w:sz w:val="15"/>
       </w:rPr>
-      <w:t>生成时间：2026-10-14 Asia/Shanghai｜收到 12 条肽原始序列与实验方案后需做特异性复核</w:t>
+      <w:t>初版通用抑制/神经保护背景｜12 条肽的促聚集序列特异性复核请见独立 v2 加注</w:t>
     </w:r>
   </w:p>
 </w:ftr>

</xml_diff>